<commit_message>
Regenerate 320 Rose CFD package from current handoff
</commit_message>
<xml_diff>
--- a/Project Rooms/Contract for Deed/output/320 Rose - Buyer Acknowledgment Addendum - DRAFT.docx
+++ b/Project Rooms/Contract for Deed/output/320 Rose - Buyer Acknowledgment Addendum - DRAFT.docx
@@ -44,7 +44,7 @@
         <w:t xml:space="preserve">Purchaser: </w:t>
       </w:r>
       <w:r>
-        <w:t>Ever Cardoza and Maria Sarmiento</w:t>
+        <w:t>Ever Amarildo Cardoza Bolanos and Maria Geraldina Sarmiento</w:t>
       </w:r>
     </w:p>
     <w:p>
@@ -149,7 +149,7 @@
               <w:rPr>
                 <w:b/>
               </w:rPr>
-              <w:t>Ever Cardoza</w:t>
+              <w:t>Ever Amarildo Cardoza Bolanos</w:t>
               <w:br/>
               <w:t>Initials</w:t>
             </w:r>
@@ -171,7 +171,7 @@
               <w:rPr>
                 <w:b/>
               </w:rPr>
-              <w:t>Maria Sarmiento</w:t>
+              <w:t>Maria Geraldina Sarmiento</w:t>
               <w:br/>
               <w:t>Initials</w:t>
             </w:r>
@@ -1748,12 +1748,12 @@
     </w:p>
     <w:p>
       <w:r>
-        <w:t>Ever Cardoza: ________________________________________ Date: ____________________</w:t>
+        <w:t>Ever Amarildo Cardoza Bolanos: ________________________________________ Date: ____________________</w:t>
       </w:r>
     </w:p>
     <w:p>
       <w:r>
-        <w:t>Maria Sarmiento: ________________________________________ Date: ____________________</w:t>
+        <w:t>Maria Geraldina Sarmiento: ________________________________________ Date: ____________________</w:t>
       </w:r>
     </w:p>
     <w:p>
@@ -1776,7 +1776,7 @@
     </w:p>
     <w:p>
       <w:r>
-        <w:t>I certify that the following person(s) personally appeared before me this day, each acknowledging to me that he/she/they signed the foregoing document: Ever Cardoza and Maria Sarmiento.</w:t>
+        <w:t>I certify that the following person(s) personally appeared before me this day, each acknowledging to me that he/she/they signed the foregoing document: Ever Amarildo Cardoza Bolanos and Maria Geraldina Sarmiento.</w:t>
       </w:r>
     </w:p>
     <w:p>

</xml_diff>

<commit_message>
Archive local project room updates
</commit_message>
<xml_diff>
--- a/Project Rooms/Contract for Deed/output/320 Rose - Buyer Acknowledgment Addendum - DRAFT.docx
+++ b/Project Rooms/Contract for Deed/output/320 Rose - Buyer Acknowledgment Addendum - DRAFT.docx
@@ -1800,6 +1800,7 @@
       </w:r>
     </w:p>
     <w:sectPr>
+      <w:footerReference w:type="default" r:id="rId9"/>
       <w:pgSz w:w="12240" w:h="15840"/>
       <w:pgMar w:top="1080" w:right="1008" w:bottom="1080" w:left="1008" w:header="720" w:footer="720" w:gutter="0"/>
       <w:cols w:space="720"/>
@@ -1807,6 +1808,51 @@
     </w:sectPr>
   </w:body>
 </w:document>
+</file>
+
+<file path=word/footer1.xml><?xml version="1.0" encoding="utf-8"?>
+<w:ftr xmlns:m="http://schemas.openxmlformats.org/officeDocument/2006/math" xmlns:mc="http://schemas.openxmlformats.org/markup-compatibility/2006" xmlns:mo="http://schemas.microsoft.com/office/mac/office/2008/main" xmlns:mv="urn:schemas-microsoft-com:mac:vml" xmlns:o="urn:schemas-microsoft-com:office:office" xmlns:r="http://schemas.openxmlformats.org/officeDocument/2006/relationships" xmlns:v="urn:schemas-microsoft-com:vml" xmlns:w10="urn:schemas-microsoft-com:office:word" xmlns:w14="http://schemas.microsoft.com/office/word/2010/wordml" xmlns:w="http://schemas.openxmlformats.org/wordprocessingml/2006/main" xmlns:wne="http://schemas.microsoft.com/office/word/2006/wordml" xmlns:wp14="http://schemas.microsoft.com/office/word/2010/wordprocessingDrawing" xmlns:wp="http://schemas.openxmlformats.org/drawingml/2006/wordprocessingDrawing" xmlns:wpc="http://schemas.microsoft.com/office/word/2010/wordprocessingCanvas" xmlns:wpg="http://schemas.microsoft.com/office/word/2010/wordprocessingGroup" xmlns:wpi="http://schemas.microsoft.com/office/word/2010/wordprocessingInk" xmlns:wps="http://schemas.microsoft.com/office/word/2010/wordprocessingShape" mc:Ignorable="w14 wp14">
+  <w:p>
+    <w:pPr>
+      <w:pStyle w:val="Footer"/>
+      <w:spacing w:before="0" w:after="0"/>
+      <w:jc w:val="center"/>
+    </w:pPr>
+    <w:r/>
+    <w:r>
+      <w:rPr>
+        <w:sz w:val="18"/>
+      </w:rPr>
+      <w:t xml:space="preserve">Page </w:t>
+    </w:r>
+    <w:r>
+      <w:fldChar w:fldCharType="begin"/>
+      <w:instrText xml:space="preserve">PAGE</w:instrText>
+      <w:fldChar w:fldCharType="separate"/>
+      <w:t>1</w:t>
+      <w:fldChar w:fldCharType="end"/>
+    </w:r>
+    <w:r>
+      <w:rPr>
+        <w:sz w:val="18"/>
+      </w:rPr>
+      <w:t xml:space="preserve"> of </w:t>
+    </w:r>
+    <w:r>
+      <w:fldChar w:fldCharType="begin"/>
+      <w:instrText xml:space="preserve">NUMPAGES</w:instrText>
+      <w:fldChar w:fldCharType="separate"/>
+      <w:t>1</w:t>
+      <w:fldChar w:fldCharType="end"/>
+    </w:r>
+    <w:r>
+      <w:rPr>
+        <w:sz w:val="18"/>
+      </w:rPr>
+      <w:t xml:space="preserve"> | 26-06-17 V1</w:t>
+    </w:r>
+  </w:p>
+</w:ftr>
 </file>
 
 <file path=word/numbering.xml><?xml version="1.0" encoding="utf-8"?>

</xml_diff>